<commit_message>
Add author biographies and submission checklist for manuscript
</commit_message>
<xml_diff>
--- a/paper/technology-in-society/manuscript/author_biographies.docx
+++ b/paper/technology-in-society/manuscript/author_biographies.docx
@@ -38,14 +38,10 @@
           <w:b/>
           <w:bCs/>
         </w:rPr>
-        <w:t xml:space="preserve">Dejana Pivac</w:t>
+        <w:t>Dejana Pivac has been with Infobip, Zagreb, Croatia, since 2025, initially as a Software Engineering Intern and currently as a Software Engineer, specializing in backend software development. She received the B.S. degree in Informatics from the Faculty of Informatics, Juraj Dobrila University of Pula, Pula, Croatia, in 2022 and is currently pursuing the M.S. degree in Informatics at the same institution under the supervision of Darko Etinger. Her research interests include software engineering, agent-based modeling and simulation, computational social science, and the design and governance of AI-enabled digital platforms.</w:t>
       </w:r>
-      <w:r>
-        <w:t xml:space="preserve"> </w:t>
-      </w:r>
-      <w:r>
-        <w:t xml:space="preserve">[biography to be added]</w:t>
-      </w:r>
+      <w:r/>
+      <w:r/>
     </w:p>
     <w:bookmarkEnd w:id="9"/>
     <w:sectPr>

</xml_diff>